<commit_message>
Include UViT and correct metric-dependent model and checkpoint conclusions
</commit_message>
<xml_diff>
--- a/results/00_model_selection/model_selection_review_zh.docx
+++ b/results/00_model_selection/model_selection_review_zh.docx
@@ -20,17 +20,17 @@
         <w:pStyle w:val="Heading1"/>
       </w:pPr>
       <w:r>
-        <w:t>建议与证据</w:t>
+        <w:t>修订结论与候选证据</w:t>
       </w:r>
     </w:p>
     <w:p>
       <w:r>
-        <w:t>建议采用旧版final DDPM epoch1800作为生成质量主候选。在DDPM与DiT各40个现存checkpoint中，该批次6-mer PCC最高，为0.9724；相比当年选定的DiT epoch1050，6-mer PCC更高、GC分布WD与motif位置WD更低。该结论限于已存在的采样结果，不代表DDPM在全部指标和全部模型中最优。</w:t>
+        <w:t>修订结论：此前遗漏UViT，并将6-mer最高的DDPM1800过早推荐为最终权重，现撤回这一口径。DDPM1800仅是6-mer组成指标上的候选；旧版final DDPM的最低WD在epoch900，DiT也有更低的WD，2024批次的最低WD属于UViT-v2 config4 epoch1800。最终模型和权重尚未确定。</w:t>
       </w:r>
     </w:p>
     <w:p>
       <w:r>
-        <w:t>推荐权重：topic_all/topic2_Diffusion/DDPM/final/DDPM/params/epoch_1800_params.pkl。SHA256：431b3c843a23a041225cd5be770550b7478494ab830d68f6f5162d683d36d1de。</w:t>
+        <w:t>DDPM1800候选权重（尚未最终选定）：topic_all/topic2_Diffusion/DDPM/final/DDPM/params/epoch_1800_params.pkl。SHA256：431b3c843a23a041225cd5be770550b7478494ab830d68f6f5162d683d36d1de。</w:t>
       </w:r>
     </w:p>
     <w:p>
@@ -382,12 +382,12 @@
         <w:pStyle w:val="Heading1"/>
       </w:pPr>
       <w:r>
-        <w:t>论文结果建议表述</w:t>
+        <w:t>可采用的候选比较表述（不能作为最终选型结论）</w:t>
       </w:r>
     </w:p>
     <w:p>
       <w:r>
-        <w:t>为选择生成模型及其采样权重，我们对旧版DDPM和DiT各40个checkpoint的现存序列进行了统一长度与样本量的回顾性评价。在本轮80个采样批次中，DDPM epoch1800达到最高的6-mer频率相关性（PCC=0.9724）。与历史选择的DiT epoch1050相比，该批次同时表现出更低的GC分布Wasserstein距离（0.0109 vs. 0.0389）和JASPAR motif中心位置分布距离（0.6666 vs. 0.7735）。这些结果支持将DDPM epoch1800作为生成质量主候选，同时保留不同指标所指向的其他checkpoint。</w:t>
+        <w:t>为选择生成模型及其采样权重，我们对旧版DDPM和DiT各40个checkpoint的现存序列进行了统一长度与样本量的回顾性评价。在本轮80个采样批次中，DDPM epoch1800达到最高的6-mer频率相关性（PCC=0.9724）。与历史选择的DiT epoch1050相比，该批次同时表现出更低的GC分布Wasserstein距离（0.0109 vs. 0.0389）和JASPAR motif中心位置分布距离（0.6666 vs. 0.7735）。这些结果支持保留DDPM epoch1800作为6-mer组成接近度候选，但不证明其WD最小或优于UViT；主指标及质量门槛尚未冻结，最终模型与权重未确定。</w:t>
       </w:r>
     </w:p>
     <w:p>
@@ -421,6 +421,70 @@
     <w:p>
       <w:r>
         <w:t>原始采样种子和不可变权重哈希缺失；当前哈希用于冻结现存文件。</w:t>
+      </w:r>
+    </w:p>
+    <w:p>
+      <w:r>
+        <w:br w:type="page"/>
+      </w:r>
+    </w:p>
+    <w:p>
+      <w:pPr>
+        <w:pStyle w:val="Heading1"/>
+      </w:pPr>
+      <w:r>
+        <w:t>修订补图：加入UViT</w:t>
+      </w:r>
+    </w:p>
+    <w:p>
+      <w:r>
+        <w:drawing>
+          <wp:inline xmlns:a="http://schemas.openxmlformats.org/drawingml/2006/main" xmlns:pic="http://schemas.openxmlformats.org/drawingml/2006/picture">
+            <wp:extent cx="5760000" cy="2421069"/>
+            <wp:docPr id="3" name="Picture 3"/>
+            <wp:cNvGraphicFramePr>
+              <a:graphicFrameLocks noChangeAspect="1"/>
+            </wp:cNvGraphicFramePr>
+            <a:graphic>
+              <a:graphicData uri="http://schemas.openxmlformats.org/drawingml/2006/picture">
+                <pic:pic>
+                  <pic:nvPicPr>
+                    <pic:cNvPr id="0" name="figure_uvit_comparison.png"/>
+                    <pic:cNvPicPr/>
+                  </pic:nvPicPr>
+                  <pic:blipFill>
+                    <a:blip r:embed="rId11"/>
+                    <a:stretch>
+                      <a:fillRect/>
+                    </a:stretch>
+                  </pic:blipFill>
+                  <pic:spPr>
+                    <a:xfrm>
+                      <a:off x="0" y="0"/>
+                      <a:ext cx="5760000" cy="2421069"/>
+                    </a:xfrm>
+                    <a:prstGeom prst="rect"/>
+                  </pic:spPr>
+                </pic:pic>
+              </a:graphicData>
+            </a:graphic>
+          </wp:inline>
+        </w:drawing>
+      </w:r>
+    </w:p>
+    <w:p>
+      <w:r>
+        <w:t>本图属于JASPAR2024、真实参照343383命中的历史批次，与前面旧版final的JASPAR2022数据分开。UViT-v2 config4 epoch1800的最低WD为0.1404，低于DDPM-M的0.2815。因此若以该批次的motif位置WD为主要指标，不能选择DDPM并称其最好。</w:t>
+      </w:r>
+    </w:p>
+    <w:p>
+      <w:r>
+        <w:t>旧版final DDPM的最低位置WD在epoch900（0.4223），1800为0.6666。旧版DiT的最低位置WD在epoch100（0.2875），但该批次6-mer PCC仅0.0140、GC均值70.08%，说明单一位置WD不足以判断整体生成质量。也不能借此排除其他DiT批次。</w:t>
+      </w:r>
+    </w:p>
+    <w:p>
+      <w:r>
+        <w:t>历史四模型表中，DiT的JASPAR WD中位数0.8423低于DDPM的1.0500。此结果已保留，不以TF面板上的相反排序覆盖。最终选择需要在所有模型的同一评价协议下，明确主指标和最低质量条件。</w:t>
       </w:r>
     </w:p>
     <w:sectPr>

</xml_diff>